<commit_message>
refactor(scripts): drive doc generation with {{token}} placeholders
Replace positional/shape-name slot location in the docx and pptx
generators with token-based placeholder replacement. Templates carry
literal {{TOKEN}} markers; generators duplicate the branded template and
fill slots by token text, so the templates can be re-laid-out without
breaking generation.

- add token_fill.py shared engine (run-level substitution, spec loader)
- add tokenize_templates.py to inject markers into branded templates
- rewrite generate_docx/ppt to clone token-marked blocks by token
- route generate_xlsx through the shared loader (stays table-driven)
- delete dead dash-variant duplicates and stale create_templates.py

Co-Authored-By: Claude Opus 4.8 <noreply@anthropic.com>
</commit_message>
<xml_diff>
--- a/templates/Modele_AGEVP.docx
+++ b/templates/Modele_AGEVP.docx
@@ -95,7 +95,7 @@
           <w:sz w:val="40"/>
           <w:szCs w:val="40"/>
         </w:rPr>
-        <w:t xml:space="preserve">[ Titre du document ]</w:t>
+        <w:t xml:space="preserve">{{DOC_TITLE}}</w:t>
       </w:r>
     </w:p>
     <w:p>
@@ -114,7 +114,7 @@
           <w:sz w:val="22"/>
           <w:szCs w:val="22"/>
         </w:rPr>
-        <w:t xml:space="preserve">[ Sous-titre ou contexte — ex. Soirée de rentrée 2026 ]</w:t>
+        <w:t xml:space="preserve">{{DOC_SUBTITLE}}</w:t>
       </w:r>
     </w:p>
     <w:p>
@@ -135,7 +135,7 @@
           <w:sz w:val="24"/>
           <w:szCs w:val="24"/>
         </w:rPr>
-        <w:t xml:space="preserve">1  </w:t>
+        <w:t xml:space="preserve">{{SEC_NUM}}</w:t>
       </w:r>
       <w:r>
         <w:rPr>
@@ -146,7 +146,7 @@
           <w:sz w:val="24"/>
           <w:szCs w:val="24"/>
         </w:rPr>
-        <w:t xml:space="preserve">[ Titre de section ]</w:t>
+        <w:t xml:space="preserve">{{SEC_TITLE}}</w:t>
       </w:r>
     </w:p>
     <w:p>
@@ -162,7 +162,7 @@
           <w:sz w:val="20"/>
           <w:szCs w:val="20"/>
         </w:rPr>
-        <w:t xml:space="preserve">[ Paragraphe d'introduction : présentez brièvement l'objet du document. Remplacez ce texte. ]</w:t>
+        <w:t xml:space="preserve">{{SEC_BODY}}</w:t>
       </w:r>
     </w:p>
     <w:p>

</xml_diff>